<commit_message>
Focus writing workshop on each Spyri200 group project and simplify materials
</commit_message>
<xml_diff>
--- a/Heidi_Arbeitsgrundlage_Gruppen.docx
+++ b/Heidi_Arbeitsgrundlage_Gruppen.docx
@@ -7,20 +7,12 @@
         <w:pStyle w:val="Title"/>
       </w:pPr>
       <w:r>
-        <w:t>Eine neue Heidi Erzählung</w:t>
-      </w:r>
-    </w:p>
-    <w:p>
-      <w:pPr>
-        <w:pStyle w:val="Subtitle"/>
-      </w:pPr>
-      <w:r>
-        <w:t>Abschluss der Gruppenarbeiten zu Heidi und zur Ausstellung Spyri 200</w:t>
+        <w:t>Spyri200 Schreibwerkstatt</w:t>
       </w:r>
     </w:p>
     <w:p>
       <w:r>
-        <w:t>Ihr verwandelt Erkenntnisse aus euren Gruppenarbeiten in eine neue Erzählung mit Heidi. Eure Geschichte soll zeigen, wie ihr Figuren, Konflikte und Erzählweise verstanden habt. ChatGPT kann einen Entwurf liefern; Auswahl, Planung, Quellenprüfung und Endfassung verantwortet ihr als Gruppe.</w:t>
+        <w:t>Aus eurem Gruppenprojekt wird eine neue Erzählung. Ausgangspunkt sind eure Leitfrage, eure gelesenen Texte und eure belegten Erkenntnisse.</w:t>
       </w:r>
     </w:p>
     <w:p>
@@ -28,7 +20,12 @@
         <w:pStyle w:val="Heading2"/>
       </w:pPr>
       <w:r>
-        <w:t>Euer Produkt</w:t>
+        <w:t>Auftrag</w:t>
+      </w:r>
+    </w:p>
+    <w:p>
+      <w:r>
+        <w:t>Entwickelt eine Ergänzung oder Fortschreibung zu einem eurer Projekttexte. Legt Figuren und Anschlussstelle fest. Eine Übertragung in die Gegenwart ist nach Absprache möglich. Für die Arbeit sind rund drei Lektionen vorgesehen.</w:t>
       </w:r>
     </w:p>
     <w:p>
@@ -36,7 +33,7 @@
         <w:pStyle w:val="ListBullet"/>
       </w:pPr>
       <w:r>
-        <w:t>Eine zusammenhängende Erzählung mit Titel und 700–900 Wörtern. Heidi handelt selbst und trifft mindestens eine folgenreiche Entscheidung. Beschränkt euch auf einen Hauptkonflikt und höchstens drei Szenen.</w:t>
+        <w:t>700–900 Wörter, ein Hauptkonflikt und höchstens drei Szenen.</w:t>
       </w:r>
     </w:p>
     <w:p>
@@ -44,7 +41,7 @@
         <w:pStyle w:val="ListBullet"/>
       </w:pPr>
       <w:r>
-        <w:t>Drei belegte Erkenntnisse werden für den Verlauf wichtig: mindestens eine aus eurer eigenen Arbeit und mindestens eine aus einer anderen Gruppe. Mindestens zwei Belege stammen aus dem Roman; ein weiterer kann aus Ausstellung, Film- oder Wirkungsgeschichte stammen.</w:t>
+        <w:t>Mindestens drei belegte Erkenntnisse: eine aus eurem eigenen und eine aus einem anderen Gruppenprojekt. Mindestens zwei sind an den gelesenen Primärtexten belegt.</w:t>
       </w:r>
     </w:p>
     <w:p>
@@ -52,7 +49,15 @@
         <w:pStyle w:val="ListBullet"/>
       </w:pPr>
       <w:r>
-        <w:t>Ein Werkkommentar von 200–250 Wörtern erklärt eure Entscheidungen und die Grenzen der Annäherung an Spyri. Dazu legt ihr den Erkenntnisbogen und drei begründete Überarbeitungen vor.</w:t>
+        <w:t>Die Erkenntnisse prägen Entscheidungen, Konflikte und Folgen. Eure Hauptfigur handelt selbst; ihre Beweggründe sind nachvollziehbar.</w:t>
+      </w:r>
+    </w:p>
+    <w:p>
+      <w:pPr>
+        <w:pStyle w:val="ListBullet"/>
+      </w:pPr>
+      <w:r>
+        <w:t>Orientiert euch sprachlich an einer Originalpassage von Spyri. Atmosphäre und Plausibilität haben Vorrang. Verwendet einen zurückhaltenden Schweizer Ton, ss und «Guillemets».</w:t>
       </w:r>
     </w:p>
     <w:p>
@@ -60,12 +65,22 @@
         <w:pStyle w:val="Heading2"/>
       </w:pPr>
       <w:r>
-        <w:t>Wählt eure Erzählform</w:t>
+        <w:t>Schreiben und überarbeiten</w:t>
       </w:r>
     </w:p>
     <w:p>
       <w:r>
-        <w:t>Ergänzung: Erzählt eine neue Episode innerhalb der Romanwelt und legt genau fest, zwischen welchen Ereignissen sie stattfindet. Oder Fortschreibung: Setzt nach dem gemeinsam gelesenen Teil ein und notiert den dort erreichten Figurenstand. Eine Übertragung in die Gegenwart ist nach Absprache möglich; kennzeichnet dann ausdrücklich, was ihr verändert. Vermischt Roman und Verfilmungen nicht unbemerkt.</w:t>
+        <w:t>Füllt zuerst den Erkenntnisbogen aus und plant die Handlung. Schreibt dann selbst oder erstellt auf der Website einen Prompt, den ihr in ChatGPT kopiert. Beide Arbeitswege haben dieselben Anforderungen.</w:t>
+      </w:r>
+    </w:p>
+    <w:p>
+      <w:r>
+        <w:t>Prüft gemeinsam: Wie wirken eure Erkenntnisse in der Handlung? Stimmen Beweggründe, Figurenwissen und Bezüge zu den Ausgangstexten? Passen Figurenrede, Wahrnehmung und Atmosphäre zusammen?</w:t>
+      </w:r>
+    </w:p>
+    <w:p>
+      <w:r>
+        <w:t>Eine andere Gruppe benennt zwei erkennbare Erkenntnisse samt Textstellen sowie eine unklare und eine gelungene Passage. Überarbeitet anschliessend Plausibilität, Sprache und Umsetzung der Erkenntnisse.</w:t>
       </w:r>
     </w:p>
     <w:p>
@@ -73,671 +88,44 @@
         <w:pStyle w:val="Heading2"/>
       </w:pPr>
       <w:r>
-        <w:t>Arbeit in drei Lektionen</w:t>
+        <w:t>Abgabe</w:t>
       </w:r>
     </w:p>
-    <w:tbl>
-      <w:tblPr>
-        <w:tblW w:type="auto" w:w="0"/>
-        <w:tblLayout w:type="fixed"/>
-        <w:tblLook w:firstColumn="1" w:firstRow="1" w:lastColumn="0" w:lastRow="0" w:noHBand="0" w:noVBand="1" w:val="04A0"/>
-      </w:tblPr>
-      <w:tblGrid>
-        <w:gridCol w:w="4032"/>
-        <w:gridCol w:w="1152"/>
-        <w:gridCol w:w="4896"/>
-      </w:tblGrid>
-      <w:tr>
-        <w:trPr>
-          <w:cantSplit/>
-        </w:trPr>
-        <w:tc>
-          <w:tcPr>
-            <w:tcW w:type="dxa" w:w="4032"/>
-            <w:tcBorders>
-              <w:top w:val="single" w:sz="4" w:color="D9D9D9"/>
-              <w:left w:val="single" w:sz="4" w:color="D9D9D9"/>
-              <w:bottom w:val="single" w:sz="4" w:color="D9D9D9"/>
-              <w:right w:val="single" w:sz="4" w:color="D9D9D9"/>
-            </w:tcBorders>
-            <w:tcMar>
-              <w:top w:w="85" w:type="dxa"/>
-              <w:left w:w="85" w:type="dxa"/>
-              <w:bottom w:w="85" w:type="dxa"/>
-              <w:right w:w="85" w:type="dxa"/>
-            </w:tcMar>
-            <w:shd w:fill="E4ECF0"/>
-          </w:tcPr>
-          <w:p>
-            <w:pPr>
-              <w:spacing w:after="60"/>
-            </w:pPr>
-            <w:r>
-              <w:rPr>
-                <w:b/>
-                <w:sz w:val="20"/>
-              </w:rPr>
-              <w:t>Schritt</w:t>
-            </w:r>
-          </w:p>
-        </w:tc>
-        <w:tc>
-          <w:tcPr>
-            <w:tcW w:type="dxa" w:w="1152"/>
-            <w:tcBorders>
-              <w:top w:val="single" w:sz="4" w:color="D9D9D9"/>
-              <w:left w:val="single" w:sz="4" w:color="D9D9D9"/>
-              <w:bottom w:val="single" w:sz="4" w:color="D9D9D9"/>
-              <w:right w:val="single" w:sz="4" w:color="D9D9D9"/>
-            </w:tcBorders>
-            <w:tcMar>
-              <w:top w:w="85" w:type="dxa"/>
-              <w:left w:w="85" w:type="dxa"/>
-              <w:bottom w:w="85" w:type="dxa"/>
-              <w:right w:w="85" w:type="dxa"/>
-            </w:tcMar>
-            <w:shd w:fill="E4ECF0"/>
-          </w:tcPr>
-          <w:p>
-            <w:pPr>
-              <w:spacing w:after="60"/>
-            </w:pPr>
-            <w:r>
-              <w:rPr>
-                <w:b/>
-                <w:sz w:val="20"/>
-              </w:rPr>
-              <w:t>Zeit</w:t>
-            </w:r>
-          </w:p>
-        </w:tc>
-        <w:tc>
-          <w:tcPr>
-            <w:tcW w:type="dxa" w:w="4896"/>
-            <w:tcBorders>
-              <w:top w:val="single" w:sz="4" w:color="D9D9D9"/>
-              <w:left w:val="single" w:sz="4" w:color="D9D9D9"/>
-              <w:bottom w:val="single" w:sz="4" w:color="D9D9D9"/>
-              <w:right w:val="single" w:sz="4" w:color="D9D9D9"/>
-            </w:tcBorders>
-            <w:tcMar>
-              <w:top w:w="85" w:type="dxa"/>
-              <w:left w:w="85" w:type="dxa"/>
-              <w:bottom w:w="85" w:type="dxa"/>
-              <w:right w:w="85" w:type="dxa"/>
-            </w:tcMar>
-            <w:shd w:fill="E4ECF0"/>
-          </w:tcPr>
-          <w:p>
-            <w:pPr>
-              <w:spacing w:after="60"/>
-            </w:pPr>
-            <w:r>
-              <w:rPr>
-                <w:b/>
-                <w:sz w:val="20"/>
-              </w:rPr>
-              <w:t>Ergebnis</w:t>
-            </w:r>
-          </w:p>
-        </w:tc>
-      </w:tr>
-      <w:tr>
-        <w:trPr>
-          <w:cantSplit/>
-        </w:trPr>
-        <w:tc>
-          <w:tcPr>
-            <w:tcW w:type="dxa" w:w="4032"/>
-            <w:tcBorders>
-              <w:top w:val="single" w:sz="4" w:color="D9D9D9"/>
-              <w:left w:val="single" w:sz="4" w:color="D9D9D9"/>
-              <w:bottom w:val="single" w:sz="4" w:color="D9D9D9"/>
-              <w:right w:val="single" w:sz="4" w:color="D9D9D9"/>
-            </w:tcBorders>
-            <w:tcMar>
-              <w:top w:w="85" w:type="dxa"/>
-              <w:left w:w="85" w:type="dxa"/>
-              <w:bottom w:w="85" w:type="dxa"/>
-              <w:right w:w="85" w:type="dxa"/>
-            </w:tcMar>
-          </w:tcPr>
-          <w:p>
-            <w:pPr>
-              <w:spacing w:after="60"/>
-            </w:pPr>
-            <w:r>
-              <w:rPr>
-                <w:b w:val="0"/>
-                <w:sz w:val="20"/>
-              </w:rPr>
-              <w:t>1 Erkenntnisse austauschen</w:t>
-            </w:r>
-          </w:p>
-        </w:tc>
-        <w:tc>
-          <w:tcPr>
-            <w:tcW w:type="dxa" w:w="1152"/>
-            <w:tcBorders>
-              <w:top w:val="single" w:sz="4" w:color="D9D9D9"/>
-              <w:left w:val="single" w:sz="4" w:color="D9D9D9"/>
-              <w:bottom w:val="single" w:sz="4" w:color="D9D9D9"/>
-              <w:right w:val="single" w:sz="4" w:color="D9D9D9"/>
-            </w:tcBorders>
-            <w:tcMar>
-              <w:top w:w="85" w:type="dxa"/>
-              <w:left w:w="85" w:type="dxa"/>
-              <w:bottom w:w="85" w:type="dxa"/>
-              <w:right w:w="85" w:type="dxa"/>
-            </w:tcMar>
-          </w:tcPr>
-          <w:p>
-            <w:pPr>
-              <w:spacing w:after="60"/>
-            </w:pPr>
-            <w:r>
-              <w:rPr>
-                <w:b w:val="0"/>
-                <w:sz w:val="20"/>
-              </w:rPr>
-              <w:t>20 Min.</w:t>
-            </w:r>
-          </w:p>
-        </w:tc>
-        <w:tc>
-          <w:tcPr>
-            <w:tcW w:type="dxa" w:w="4896"/>
-            <w:tcBorders>
-              <w:top w:val="single" w:sz="4" w:color="D9D9D9"/>
-              <w:left w:val="single" w:sz="4" w:color="D9D9D9"/>
-              <w:bottom w:val="single" w:sz="4" w:color="D9D9D9"/>
-              <w:right w:val="single" w:sz="4" w:color="D9D9D9"/>
-            </w:tcBorders>
-            <w:tcMar>
-              <w:top w:w="85" w:type="dxa"/>
-              <w:left w:w="85" w:type="dxa"/>
-              <w:bottom w:w="85" w:type="dxa"/>
-              <w:right w:w="85" w:type="dxa"/>
-            </w:tcMar>
-          </w:tcPr>
-          <w:p>
-            <w:pPr>
-              <w:spacing w:after="60"/>
-            </w:pPr>
-            <w:r>
-              <w:rPr>
-                <w:b w:val="0"/>
-                <w:sz w:val="20"/>
-              </w:rPr>
-              <w:t>Drei Erkenntnisse mit überprüften Fundstellen</w:t>
-            </w:r>
-          </w:p>
-        </w:tc>
-      </w:tr>
-      <w:tr>
-        <w:trPr>
-          <w:cantSplit/>
-        </w:trPr>
-        <w:tc>
-          <w:tcPr>
-            <w:tcW w:type="dxa" w:w="4032"/>
-            <w:tcBorders>
-              <w:top w:val="single" w:sz="4" w:color="D9D9D9"/>
-              <w:left w:val="single" w:sz="4" w:color="D9D9D9"/>
-              <w:bottom w:val="single" w:sz="4" w:color="D9D9D9"/>
-              <w:right w:val="single" w:sz="4" w:color="D9D9D9"/>
-            </w:tcBorders>
-            <w:tcMar>
-              <w:top w:w="85" w:type="dxa"/>
-              <w:left w:w="85" w:type="dxa"/>
-              <w:bottom w:w="85" w:type="dxa"/>
-              <w:right w:w="85" w:type="dxa"/>
-            </w:tcMar>
-          </w:tcPr>
-          <w:p>
-            <w:pPr>
-              <w:spacing w:after="60"/>
-            </w:pPr>
-            <w:r>
-              <w:rPr>
-                <w:b w:val="0"/>
-                <w:sz w:val="20"/>
-              </w:rPr>
-              <w:t>2 Handlung selbst planen</w:t>
-            </w:r>
-          </w:p>
-        </w:tc>
-        <w:tc>
-          <w:tcPr>
-            <w:tcW w:type="dxa" w:w="1152"/>
-            <w:tcBorders>
-              <w:top w:val="single" w:sz="4" w:color="D9D9D9"/>
-              <w:left w:val="single" w:sz="4" w:color="D9D9D9"/>
-              <w:bottom w:val="single" w:sz="4" w:color="D9D9D9"/>
-              <w:right w:val="single" w:sz="4" w:color="D9D9D9"/>
-            </w:tcBorders>
-            <w:tcMar>
-              <w:top w:w="85" w:type="dxa"/>
-              <w:left w:w="85" w:type="dxa"/>
-              <w:bottom w:w="85" w:type="dxa"/>
-              <w:right w:w="85" w:type="dxa"/>
-            </w:tcMar>
-          </w:tcPr>
-          <w:p>
-            <w:pPr>
-              <w:spacing w:after="60"/>
-            </w:pPr>
-            <w:r>
-              <w:rPr>
-                <w:b w:val="0"/>
-                <w:sz w:val="20"/>
-              </w:rPr>
-              <w:t>20 Min.</w:t>
-            </w:r>
-          </w:p>
-        </w:tc>
-        <w:tc>
-          <w:tcPr>
-            <w:tcW w:type="dxa" w:w="4896"/>
-            <w:tcBorders>
-              <w:top w:val="single" w:sz="4" w:color="D9D9D9"/>
-              <w:left w:val="single" w:sz="4" w:color="D9D9D9"/>
-              <w:bottom w:val="single" w:sz="4" w:color="D9D9D9"/>
-              <w:right w:val="single" w:sz="4" w:color="D9D9D9"/>
-            </w:tcBorders>
-            <w:tcMar>
-              <w:top w:w="85" w:type="dxa"/>
-              <w:left w:w="85" w:type="dxa"/>
-              <w:bottom w:w="85" w:type="dxa"/>
-              <w:right w:w="85" w:type="dxa"/>
-            </w:tcMar>
-          </w:tcPr>
-          <w:p>
-            <w:pPr>
-              <w:spacing w:after="60"/>
-            </w:pPr>
-            <w:r>
-              <w:rPr>
-                <w:b w:val="0"/>
-                <w:sz w:val="20"/>
-              </w:rPr>
-              <w:t>Ein Hauptkonflikt und ein Plan aus fünf Schritten</w:t>
-            </w:r>
-          </w:p>
-        </w:tc>
-      </w:tr>
-      <w:tr>
-        <w:trPr>
-          <w:cantSplit/>
-        </w:trPr>
-        <w:tc>
-          <w:tcPr>
-            <w:tcW w:type="dxa" w:w="4032"/>
-            <w:tcBorders>
-              <w:top w:val="single" w:sz="4" w:color="D9D9D9"/>
-              <w:left w:val="single" w:sz="4" w:color="D9D9D9"/>
-              <w:bottom w:val="single" w:sz="4" w:color="D9D9D9"/>
-              <w:right w:val="single" w:sz="4" w:color="D9D9D9"/>
-            </w:tcBorders>
-            <w:tcMar>
-              <w:top w:w="85" w:type="dxa"/>
-              <w:left w:w="85" w:type="dxa"/>
-              <w:bottom w:w="85" w:type="dxa"/>
-              <w:right w:w="85" w:type="dxa"/>
-            </w:tcMar>
-          </w:tcPr>
-          <w:p>
-            <w:pPr>
-              <w:spacing w:after="60"/>
-            </w:pPr>
-            <w:r>
-              <w:rPr>
-                <w:b w:val="0"/>
-                <w:sz w:val="20"/>
-              </w:rPr>
-              <w:t>3 Entwurf schreiben lassen oder selbst schreiben</w:t>
-            </w:r>
-          </w:p>
-        </w:tc>
-        <w:tc>
-          <w:tcPr>
-            <w:tcW w:type="dxa" w:w="1152"/>
-            <w:tcBorders>
-              <w:top w:val="single" w:sz="4" w:color="D9D9D9"/>
-              <w:left w:val="single" w:sz="4" w:color="D9D9D9"/>
-              <w:bottom w:val="single" w:sz="4" w:color="D9D9D9"/>
-              <w:right w:val="single" w:sz="4" w:color="D9D9D9"/>
-            </w:tcBorders>
-            <w:tcMar>
-              <w:top w:w="85" w:type="dxa"/>
-              <w:left w:w="85" w:type="dxa"/>
-              <w:bottom w:w="85" w:type="dxa"/>
-              <w:right w:w="85" w:type="dxa"/>
-            </w:tcMar>
-          </w:tcPr>
-          <w:p>
-            <w:pPr>
-              <w:spacing w:after="60"/>
-            </w:pPr>
-            <w:r>
-              <w:rPr>
-                <w:b w:val="0"/>
-                <w:sz w:val="20"/>
-              </w:rPr>
-              <w:t>15 Min.</w:t>
-            </w:r>
-          </w:p>
-        </w:tc>
-        <w:tc>
-          <w:tcPr>
-            <w:tcW w:type="dxa" w:w="4896"/>
-            <w:tcBorders>
-              <w:top w:val="single" w:sz="4" w:color="D9D9D9"/>
-              <w:left w:val="single" w:sz="4" w:color="D9D9D9"/>
-              <w:bottom w:val="single" w:sz="4" w:color="D9D9D9"/>
-              <w:right w:val="single" w:sz="4" w:color="D9D9D9"/>
-            </w:tcBorders>
-            <w:tcMar>
-              <w:top w:w="85" w:type="dxa"/>
-              <w:left w:w="85" w:type="dxa"/>
-              <w:bottom w:w="85" w:type="dxa"/>
-              <w:right w:w="85" w:type="dxa"/>
-            </w:tcMar>
-          </w:tcPr>
-          <w:p>
-            <w:pPr>
-              <w:spacing w:after="60"/>
-            </w:pPr>
-            <w:r>
-              <w:rPr>
-                <w:b w:val="0"/>
-                <w:sz w:val="20"/>
-              </w:rPr>
-              <w:t>Gesicherte erste Fassung</w:t>
-            </w:r>
-          </w:p>
-        </w:tc>
-      </w:tr>
-      <w:tr>
-        <w:trPr>
-          <w:cantSplit/>
-        </w:trPr>
-        <w:tc>
-          <w:tcPr>
-            <w:tcW w:type="dxa" w:w="4032"/>
-            <w:tcBorders>
-              <w:top w:val="single" w:sz="4" w:color="D9D9D9"/>
-              <w:left w:val="single" w:sz="4" w:color="D9D9D9"/>
-              <w:bottom w:val="single" w:sz="4" w:color="D9D9D9"/>
-              <w:right w:val="single" w:sz="4" w:color="D9D9D9"/>
-            </w:tcBorders>
-            <w:tcMar>
-              <w:top w:w="85" w:type="dxa"/>
-              <w:left w:w="85" w:type="dxa"/>
-              <w:bottom w:w="85" w:type="dxa"/>
-              <w:right w:w="85" w:type="dxa"/>
-            </w:tcMar>
-          </w:tcPr>
-          <w:p>
-            <w:pPr>
-              <w:spacing w:after="60"/>
-            </w:pPr>
-            <w:r>
-              <w:rPr>
-                <w:b w:val="0"/>
-                <w:sz w:val="20"/>
-              </w:rPr>
-              <w:t>4 In der Gruppe überarbeiten</w:t>
-            </w:r>
-          </w:p>
-        </w:tc>
-        <w:tc>
-          <w:tcPr>
-            <w:tcW w:type="dxa" w:w="1152"/>
-            <w:tcBorders>
-              <w:top w:val="single" w:sz="4" w:color="D9D9D9"/>
-              <w:left w:val="single" w:sz="4" w:color="D9D9D9"/>
-              <w:bottom w:val="single" w:sz="4" w:color="D9D9D9"/>
-              <w:right w:val="single" w:sz="4" w:color="D9D9D9"/>
-            </w:tcBorders>
-            <w:tcMar>
-              <w:top w:w="85" w:type="dxa"/>
-              <w:left w:w="85" w:type="dxa"/>
-              <w:bottom w:w="85" w:type="dxa"/>
-              <w:right w:w="85" w:type="dxa"/>
-            </w:tcMar>
-          </w:tcPr>
-          <w:p>
-            <w:pPr>
-              <w:spacing w:after="60"/>
-            </w:pPr>
-            <w:r>
-              <w:rPr>
-                <w:b w:val="0"/>
-                <w:sz w:val="20"/>
-              </w:rPr>
-              <w:t>30 Min.</w:t>
-            </w:r>
-          </w:p>
-        </w:tc>
-        <w:tc>
-          <w:tcPr>
-            <w:tcW w:type="dxa" w:w="4896"/>
-            <w:tcBorders>
-              <w:top w:val="single" w:sz="4" w:color="D9D9D9"/>
-              <w:left w:val="single" w:sz="4" w:color="D9D9D9"/>
-              <w:bottom w:val="single" w:sz="4" w:color="D9D9D9"/>
-              <w:right w:val="single" w:sz="4" w:color="D9D9D9"/>
-            </w:tcBorders>
-            <w:tcMar>
-              <w:top w:w="85" w:type="dxa"/>
-              <w:left w:w="85" w:type="dxa"/>
-              <w:bottom w:w="85" w:type="dxa"/>
-              <w:right w:w="85" w:type="dxa"/>
-            </w:tcMar>
-          </w:tcPr>
-          <w:p>
-            <w:pPr>
-              <w:spacing w:after="60"/>
-            </w:pPr>
-            <w:r>
-              <w:rPr>
-                <w:b w:val="0"/>
-                <w:sz w:val="20"/>
-              </w:rPr>
-              <w:t>Drei begründete Änderungen</w:t>
-            </w:r>
-          </w:p>
-        </w:tc>
-      </w:tr>
-      <w:tr>
-        <w:trPr>
-          <w:cantSplit/>
-        </w:trPr>
-        <w:tc>
-          <w:tcPr>
-            <w:tcW w:type="dxa" w:w="4032"/>
-            <w:tcBorders>
-              <w:top w:val="single" w:sz="4" w:color="D9D9D9"/>
-              <w:left w:val="single" w:sz="4" w:color="D9D9D9"/>
-              <w:bottom w:val="single" w:sz="4" w:color="D9D9D9"/>
-              <w:right w:val="single" w:sz="4" w:color="D9D9D9"/>
-            </w:tcBorders>
-            <w:tcMar>
-              <w:top w:w="85" w:type="dxa"/>
-              <w:left w:w="85" w:type="dxa"/>
-              <w:bottom w:w="85" w:type="dxa"/>
-              <w:right w:w="85" w:type="dxa"/>
-            </w:tcMar>
-          </w:tcPr>
-          <w:p>
-            <w:pPr>
-              <w:spacing w:after="60"/>
-            </w:pPr>
-            <w:r>
-              <w:rPr>
-                <w:b w:val="0"/>
-                <w:sz w:val="20"/>
-              </w:rPr>
-              <w:t>5 Partnergruppe und Endredaktion</w:t>
-            </w:r>
-          </w:p>
-        </w:tc>
-        <w:tc>
-          <w:tcPr>
-            <w:tcW w:type="dxa" w:w="1152"/>
-            <w:tcBorders>
-              <w:top w:val="single" w:sz="4" w:color="D9D9D9"/>
-              <w:left w:val="single" w:sz="4" w:color="D9D9D9"/>
-              <w:bottom w:val="single" w:sz="4" w:color="D9D9D9"/>
-              <w:right w:val="single" w:sz="4" w:color="D9D9D9"/>
-            </w:tcBorders>
-            <w:tcMar>
-              <w:top w:w="85" w:type="dxa"/>
-              <w:left w:w="85" w:type="dxa"/>
-              <w:bottom w:w="85" w:type="dxa"/>
-              <w:right w:w="85" w:type="dxa"/>
-            </w:tcMar>
-          </w:tcPr>
-          <w:p>
-            <w:pPr>
-              <w:spacing w:after="60"/>
-            </w:pPr>
-            <w:r>
-              <w:rPr>
-                <w:b w:val="0"/>
-                <w:sz w:val="20"/>
-              </w:rPr>
-              <w:t>30 Min.</w:t>
-            </w:r>
-          </w:p>
-        </w:tc>
-        <w:tc>
-          <w:tcPr>
-            <w:tcW w:type="dxa" w:w="4896"/>
-            <w:tcBorders>
-              <w:top w:val="single" w:sz="4" w:color="D9D9D9"/>
-              <w:left w:val="single" w:sz="4" w:color="D9D9D9"/>
-              <w:bottom w:val="single" w:sz="4" w:color="D9D9D9"/>
-              <w:right w:val="single" w:sz="4" w:color="D9D9D9"/>
-            </w:tcBorders>
-            <w:tcMar>
-              <w:top w:w="85" w:type="dxa"/>
-              <w:left w:w="85" w:type="dxa"/>
-              <w:bottom w:w="85" w:type="dxa"/>
-              <w:right w:w="85" w:type="dxa"/>
-            </w:tcMar>
-          </w:tcPr>
-          <w:p>
-            <w:pPr>
-              <w:spacing w:after="60"/>
-            </w:pPr>
-            <w:r>
-              <w:rPr>
-                <w:b w:val="0"/>
-                <w:sz w:val="20"/>
-              </w:rPr>
-              <w:t>Rückmeldung und fertige Erzählung</w:t>
-            </w:r>
-          </w:p>
-        </w:tc>
-      </w:tr>
-      <w:tr>
-        <w:trPr>
-          <w:cantSplit/>
-        </w:trPr>
-        <w:tc>
-          <w:tcPr>
-            <w:tcW w:type="dxa" w:w="4032"/>
-            <w:tcBorders>
-              <w:top w:val="single" w:sz="4" w:color="D9D9D9"/>
-              <w:left w:val="single" w:sz="4" w:color="D9D9D9"/>
-              <w:bottom w:val="single" w:sz="4" w:color="D9D9D9"/>
-              <w:right w:val="single" w:sz="4" w:color="D9D9D9"/>
-            </w:tcBorders>
-            <w:tcMar>
-              <w:top w:w="85" w:type="dxa"/>
-              <w:left w:w="85" w:type="dxa"/>
-              <w:bottom w:w="85" w:type="dxa"/>
-              <w:right w:w="85" w:type="dxa"/>
-            </w:tcMar>
-          </w:tcPr>
-          <w:p>
-            <w:pPr>
-              <w:spacing w:after="60"/>
-            </w:pPr>
-            <w:r>
-              <w:rPr>
-                <w:b w:val="0"/>
-                <w:sz w:val="20"/>
-              </w:rPr>
-              <w:t>6 Werkkommentar und Abgabe</w:t>
-            </w:r>
-          </w:p>
-        </w:tc>
-        <w:tc>
-          <w:tcPr>
-            <w:tcW w:type="dxa" w:w="1152"/>
-            <w:tcBorders>
-              <w:top w:val="single" w:sz="4" w:color="D9D9D9"/>
-              <w:left w:val="single" w:sz="4" w:color="D9D9D9"/>
-              <w:bottom w:val="single" w:sz="4" w:color="D9D9D9"/>
-              <w:right w:val="single" w:sz="4" w:color="D9D9D9"/>
-            </w:tcBorders>
-            <w:tcMar>
-              <w:top w:w="85" w:type="dxa"/>
-              <w:left w:w="85" w:type="dxa"/>
-              <w:bottom w:w="85" w:type="dxa"/>
-              <w:right w:w="85" w:type="dxa"/>
-            </w:tcMar>
-          </w:tcPr>
-          <w:p>
-            <w:pPr>
-              <w:spacing w:after="60"/>
-            </w:pPr>
-            <w:r>
-              <w:rPr>
-                <w:b w:val="0"/>
-                <w:sz w:val="20"/>
-              </w:rPr>
-              <w:t>20 Min.</w:t>
-            </w:r>
-          </w:p>
-        </w:tc>
-        <w:tc>
-          <w:tcPr>
-            <w:tcW w:type="dxa" w:w="4896"/>
-            <w:tcBorders>
-              <w:top w:val="single" w:sz="4" w:color="D9D9D9"/>
-              <w:left w:val="single" w:sz="4" w:color="D9D9D9"/>
-              <w:bottom w:val="single" w:sz="4" w:color="D9D9D9"/>
-              <w:right w:val="single" w:sz="4" w:color="D9D9D9"/>
-            </w:tcBorders>
-            <w:tcMar>
-              <w:top w:w="85" w:type="dxa"/>
-              <w:left w:w="85" w:type="dxa"/>
-              <w:bottom w:w="85" w:type="dxa"/>
-              <w:right w:w="85" w:type="dxa"/>
-            </w:tcMar>
-          </w:tcPr>
-          <w:p>
-            <w:pPr>
-              <w:spacing w:after="60"/>
-            </w:pPr>
-            <w:r>
-              <w:rPr>
-                <w:b w:val="0"/>
-                <w:sz w:val="20"/>
-              </w:rPr>
-              <w:t>Nachweis der Synthese und des Arbeitsprozesses</w:t>
-            </w:r>
-          </w:p>
-        </w:tc>
-      </w:tr>
-    </w:tbl>
+    <w:p>
+      <w:pPr>
+        <w:pStyle w:val="ListBullet"/>
+      </w:pPr>
+      <w:r>
+        <w:t>Erzählung mit Titel und Erkenntnisbogen mit überprüften Fundstellen.</w:t>
+      </w:r>
+    </w:p>
+    <w:p>
+      <w:pPr>
+        <w:pStyle w:val="ListBullet"/>
+      </w:pPr>
+      <w:r>
+        <w:t>Werkkommentar von 200–250 Wörtern: Wie wirken die Erkenntnisse zusammen? Welche sprachliche Gestaltung habt ihr gewählt und warum? Was habt ihr verbessert?</w:t>
+      </w:r>
+    </w:p>
+    <w:p>
+      <w:pPr>
+        <w:pStyle w:val="ListBullet"/>
+      </w:pPr>
+      <w:r>
+        <w:t>Drei dokumentierte Änderungen: ursprüngliche Stelle → neue Stelle → Begründung.</w:t>
+      </w:r>
+    </w:p>
+    <w:p>
+      <w:pPr>
+        <w:pStyle w:val="ListBullet"/>
+      </w:pPr>
+      <w:r>
+        <w:t>Bei KI-Nutzung zusätzlich die Prompts und den ersten Entwurf.</w:t>
+      </w:r>
+    </w:p>
     <w:p>
       <w:r>
-        <w:t>Rollen verteilen: Quellenprüfung, Handlungsprüfung, sprachliche Redaktion und Prozessdokumentation. Bei kleineren Gruppen Rollen zusammenlegen. Jede Person liest und verantwortet die Endfassung.</w:t>
+        <w:t>Website: https://patrickfischerksa.github.io/Spyri_schreiben/</w:t>
       </w:r>
     </w:p>
     <w:p>
@@ -747,22 +135,22 @@
     </w:p>
     <w:p>
       <w:pPr>
-        <w:pStyle w:val="Heading1"/>
+        <w:pStyle w:val="Title"/>
       </w:pPr>
       <w:r>
-        <w:t>Erkenntnisse in Handlung übersetzen</w:t>
+        <w:t>Euer Erkenntnisbogen</w:t>
       </w:r>
     </w:p>
     <w:p>
       <w:r>
-        <w:t>Gruppe ____________________   Mitglieder ______________________________</w:t>
-        <w:br/>
-        <w:t>Eigenes Projektthema _________________________________________________</w:t>
+        <w:t>Projekt, Leitfrage und gelesene Texte:</w:t>
       </w:r>
     </w:p>
     <w:p>
       <w:r>
-        <w:t>Füllt diesen Bogen aus, bevor ihr ChatGPT öffnet. Eine Erkenntnis ist eine begründete Aussage, nicht bloss ein Themenwort wie «Heimat» oder «Religion».</w:t>
+        <w:t>________________________________________________________________________</w:t>
+        <w:br/>
+        <w:t>________________________________________________________________________</w:t>
       </w:r>
     </w:p>
     <w:p>
@@ -775,24 +163,22 @@
     </w:p>
     <w:p>
       <w:r>
-        <w:t>Aussage in einem Satz: __________________________________________________</w:t>
+        <w:t>Aussage: ______________________________________________________________</w:t>
       </w:r>
     </w:p>
     <w:p>
       <w:r>
-        <w:t>Beleg: Werk oder Ausstellungsteil, Kapitel oder Seite, kurze Textstelle:</w:t>
-        <w:br/>
-        <w:t>______________________________________________________________________</w:t>
+        <w:t>Beleg mit Werk und Seite oder Kapitel: _____________________________________</w:t>
       </w:r>
     </w:p>
     <w:p>
       <w:r>
-        <w:t>Herkunft: eigene Gruppe / andere Gruppe _________________________________</w:t>
+        <w:t>Herkunftsprojekt: ________________________________________________________</w:t>
       </w:r>
     </w:p>
     <w:p>
       <w:r>
-        <w:t>Folge für Entscheidung oder Konflikt: _______________________________________</w:t>
+        <w:t>Folge für eure Handlung: __________________________________________________</w:t>
       </w:r>
     </w:p>
     <w:p>
@@ -805,24 +191,22 @@
     </w:p>
     <w:p>
       <w:r>
-        <w:t>Aussage in einem Satz: __________________________________________________</w:t>
+        <w:t>Aussage: ______________________________________________________________</w:t>
       </w:r>
     </w:p>
     <w:p>
       <w:r>
-        <w:t>Beleg: Werk oder Ausstellungsteil, Kapitel oder Seite, kurze Textstelle:</w:t>
-        <w:br/>
-        <w:t>______________________________________________________________________</w:t>
+        <w:t>Beleg mit Werk und Seite oder Kapitel: _____________________________________</w:t>
       </w:r>
     </w:p>
     <w:p>
       <w:r>
-        <w:t>Herkunft: eigene Gruppe / andere Gruppe _________________________________</w:t>
+        <w:t>Herkunftsprojekt: ________________________________________________________</w:t>
       </w:r>
     </w:p>
     <w:p>
       <w:r>
-        <w:t>Folge für Entscheidung oder Konflikt: _______________________________________</w:t>
+        <w:t>Folge für eure Handlung: __________________________________________________</w:t>
       </w:r>
     </w:p>
     <w:p>
@@ -835,24 +219,22 @@
     </w:p>
     <w:p>
       <w:r>
-        <w:t>Aussage in einem Satz: __________________________________________________</w:t>
+        <w:t>Aussage: ______________________________________________________________</w:t>
       </w:r>
     </w:p>
     <w:p>
       <w:r>
-        <w:t>Beleg: Werk oder Ausstellungsteil, Kapitel oder Seite, kurze Textstelle:</w:t>
-        <w:br/>
-        <w:t>______________________________________________________________________</w:t>
+        <w:t>Beleg mit Werk und Seite oder Kapitel: _____________________________________</w:t>
       </w:r>
     </w:p>
     <w:p>
       <w:r>
-        <w:t>Herkunft: eigene Gruppe / andere Gruppe _________________________________</w:t>
+        <w:t>Herkunftsprojekt: ________________________________________________________</w:t>
       </w:r>
     </w:p>
     <w:p>
       <w:r>
-        <w:t>Folge für Entscheidung oder Konflikt: _______________________________________</w:t>
+        <w:t>Folge für eure Handlung: __________________________________________________</w:t>
       </w:r>
     </w:p>
     <w:p>
@@ -860,12 +242,22 @@
         <w:pStyle w:val="Heading2"/>
       </w:pPr>
       <w:r>
-        <w:t>So wird aus einem Befund eine Geschichte</w:t>
+        <w:t>Euer Handlungsplan</w:t>
       </w:r>
     </w:p>
     <w:p>
       <w:r>
-        <w:t>Mögliches Beispiel, erst am Roman zu prüfen: Gut gemeinte Regeln können Heidis Bedürfnisse verfehlen. Erzählerische Umsetzung: Eine erwachsene Figur plant etwas aus nachvollziehbarer Fürsorge; Heidi nimmt die Situation anders wahr und handelt. Daraus entsteht eine Konsequenz. Ein Satz wie «Heidi brauchte Freiheit» allein setzt den Befund noch nicht erzählerisch um.</w:t>
+        <w:t>Erzählform, Figuren und Anschlussstelle: ____________________________________</w:t>
+      </w:r>
+    </w:p>
+    <w:p>
+      <w:r>
+        <w:t>Notiert im Gruppendokument: Ausgangslage · Wunsch der Hauptfigur · Hindernis · Entscheidung und Folge · Veränderung.</w:t>
+      </w:r>
+    </w:p>
+    <w:p>
+      <w:r>
+        <w:t>Ergänzt drei feste Vorgaben aus eurem Ausgangstext mit Fundstellen sowie eine Originalpassage von 80–120 Wörtern als sprachliches Vorbild.</w:t>
       </w:r>
     </w:p>
     <w:p>
@@ -873,17 +265,12 @@
         <w:pStyle w:val="Heading2"/>
       </w:pPr>
       <w:r>
-        <w:t>Euer Plan in fünf Schritten</w:t>
+        <w:t>Eure Überarbeitung</w:t>
       </w:r>
     </w:p>
     <w:p>
       <w:r>
-        <w:t>Notiert im Gruppendokument: 1 Ausgangslage und Zeitpunkt im Roman; 2 Heidis konkreter Wunsch; 3 Hindernis und begründete Interessen der anderen Figur; 4 Heidis Entscheidung und ihre Folge; 5 Veränderung am Schluss. Ergänzt drei Tatsachen aus dem Roman, denen eure Episode nicht widersprechen darf.</w:t>
-      </w:r>
-    </w:p>
-    <w:p>
-      <w:r>
-        <w:t>Plausibilitätsprobe: Was weiss jede Figur? Was kann sie aus einer Äusserung tatsächlich schliessen? Ein Missverständnis muss aus der Situation entstehen. Es darf nicht nur erfunden werden, damit am Ende jemand trösten kann.</w:t>
+        <w:t>Haltet drei Änderungen im Gruppendokument fest: alte Stelle, neue Stelle, Begründung. Bewahrt eine besonders gelungene Stelle bewusst.</w:t>
       </w:r>
     </w:p>
     <w:p>
@@ -893,15 +280,15 @@
     </w:p>
     <w:p>
       <w:pPr>
-        <w:pStyle w:val="Heading1"/>
+        <w:pStyle w:val="Title"/>
       </w:pPr>
       <w:r>
-        <w:t>Mit einem kurzen Textauftrag arbeiten</w:t>
+        <w:t>Prompts bei Bedarf</w:t>
       </w:r>
     </w:p>
     <w:p>
       <w:r>
-        <w:t>Nutzt einen normalen neuen Chat. Kopiert nur den Auftrag und eure ausgefüllten Angaben hinein. Keine PDFs, Bilder oder Links zum automatischen Auslesen nötig. Die KI kennt eure Gruppenergebnisse nicht, solange ihr sie nicht als Text mitgebt. Speichert jede Fassung ausserhalb des Chats.</w:t>
+        <w:t>Ersetzt die Platzhalter durch eure eigenen Angaben. Auf der Website werden die Angaben aus dem Erkenntnisbogen eingesetzt.</w:t>
       </w:r>
     </w:p>
     <w:p>
@@ -909,45 +296,42 @@
         <w:pStyle w:val="Heading2"/>
       </w:pPr>
       <w:r>
-        <w:t>Auftrag für den ersten Entwurf</w:t>
+        <w:t>Entwurf</w:t>
       </w:r>
     </w:p>
     <w:p>
       <w:r>
-        <w:t>Kopiert den folgenden Text und ersetzt alle eckigen Klammern. Fügt insgesamt nur etwa 250–400 Wörter eigenes Material und eine Originalpassage von 80–120 Wörtern hinzu. Wählt die Passage aus eurem gelesenen Heidi-Text; sie soll eine für eure Szene passende Erzählweise zeigen.</w:t>
+        <w:t>Schreibe mit uns eine neue Erzählung von 700–900 Wörtern auf Grundlage unseres Spyri200-Gruppenprojekts. Beschränke dich auf einen Hauptkonflikt und höchstens drei Szenen. Unsere gewählte Hauptfigur soll selbst entscheiden und mit den Folgen umgehen müssen. Entwickle einen neuen Verlauf statt einer Nacherzählung. Dies ist unsere Neuschöpfung, kein Original von Spyri.</w:t>
       </w:r>
     </w:p>
     <w:p>
       <w:r>
-        <w:t>Schreibe mit uns eine neue Heidi-Erzählung von 700–900 Wörtern. Heidi muss selbst handeln. Erfinde einen neuen Verlauf; fasse keine bekannte Episode nacherzählend zusammen. Dies ist eine heutige Neuschöpfung, kein Original von Spyri.</w:t>
+        <w:t>Unser Projekt, unsere Leitfrage und die gelesenen Texte: [Projekt]</w:t>
+        <w:br/>
+        <w:t>Erzählform, Figuren und genauer Anschluss: [Anschluss]</w:t>
+        <w:br/>
+        <w:t>Drei feste Vorgaben aus dem Ausgangstext: [Vorgaben]</w:t>
+        <w:br/>
+        <w:t>Drei Erkenntnisse mit Belegen, Herkunftsprojekt und Folgen für die Handlung: [Erkenntnisse]</w:t>
+        <w:br/>
+        <w:t>Unser Plan in fünf Schritten: [Plan]</w:t>
+        <w:br/>
+        <w:t>Originalpassage als sprachliches Vorbild mit Fundstelle: [Passage]</w:t>
       </w:r>
     </w:p>
     <w:p>
       <w:r>
-        <w:t>Erzählform und Zeitpunkt: [Ergänzung oder Fortschreibung; genauer Anschluss]</w:t>
-        <w:br/>
-        <w:t>Drei feste Tatsachen aus dem Roman: [einsetzen]</w:t>
-        <w:br/>
-        <w:t>Drei Erkenntnisse mit Belegen und Herkunft: [E1, E2, E3 einsetzen]</w:t>
-        <w:br/>
-        <w:t>Unser Plan aus fünf Schritten: [einsetzen]</w:t>
-        <w:br/>
-        <w:t>Originalpassage als sprachliches Vorbild: [80–120 Wörter mit Fundstelle]</w:t>
+        <w:t>Halte dich an unseren Plan. Die Erkenntnisse sollen Entscheidungen, Konflikte und Folgen prägen. Mindestens eine stammt aus unserem eigenen und eine aus einem anderen Gruppenprojekt; mindestens zwei sind an den gelesenen Primärtexten belegt. Übertrage die Erkenntnis aus dem anderen Projekt sinnvoll auf unsere Geschichte, ohne die Werke oder ihre Figurenwelten zu vermischen. Erfinde keine Textbelege, Quellen oder angeblichen Projektergebnisse. Bei wesentlichen Lücken oder Widersprüchen frage zuerst nach.</w:t>
       </w:r>
     </w:p>
     <w:p>
       <w:r>
-        <w:t>Halte dich an unseren Plan. Lass die Erkenntnisse Entscheidungen, Beziehungen oder Folgen prägen. Schreibe sie nicht als Schulwissen in Dialoge. Figuren dürfen nur wissen, was sie erfahren haben; Motive und Missverständnisse müssen nachvollziehbar sein. Erfinde keine angeblichen Romanfakten, Quellen oder Zitate. Nutze spätere Wirkungsgeschichte nur als Gestaltungsanregung, nicht als Wissen der historischen Figuren.</w:t>
+        <w:t>Plausibilität, nachvollziehbare Beweggründe und Atmosphäre haben Vorrang. Figuren dürfen nur wissen, was sie erfahren haben. Verbinde Wahrnehmung, innere Bewegung und Handlung. Orientiere dich sprachlich an der Originalpassage, ohne Sätze zu kopieren oder künstlich altertümlich zu schreiben. Verwende Schweizer Rechtschreibung mit ss und Guillemets («…») und einen zurückhaltenden, authentischen Schweizer Ton. Zeige am Schluss eine Veränderung statt einer angehängten Moral.</w:t>
       </w:r>
     </w:p>
     <w:p>
       <w:r>
-        <w:t>Verbinde Wahrnehmung, innere Bewegung und Handlung. Schaffe Atmosphäre durch wenige bedeutsame Einzelheiten. Kinder sprechen konkret und unmittelbar. Verwende Schweizer Rechtschreibung und «Guillemetts», mit zurückhaltendem regionalem Ton, ohne künstlichen Dialekt. Orientiere dich an der Originalpassage, ohne Sätze zu kopieren. Zeige am Ende eine Veränderung; vermeide eine bloss angehängte Moral.</w:t>
-      </w:r>
-    </w:p>
-    <w:p>
-      <w:r>
-        <w:t>Wenn im Material ein wesentlicher Widerspruch steckt, nenne ihn kurz statt ihn stillschweigend zu erfinden. Sonst gib Titel und Erzählung aus. Nenne danach in höchstens 80 Wörtern, wo E1 bis E3 wirksam werden und welche Romanangabe wir nochmals prüfen müssen.</w:t>
+        <w:t>Gib Titel und Erzählung aus. Erläutere danach in höchstens 80 Wörtern, wo die drei Erkenntnisse wirksam werden und welche Textangaben wir nochmals prüfen sollten.</w:t>
       </w:r>
     </w:p>
     <w:p>
@@ -955,547 +339,30 @@
         <w:pStyle w:val="Heading2"/>
       </w:pPr>
       <w:r>
-        <w:t>Ein zweiter Auftrag nur bei Bedarf</w:t>
+        <w:t>Gezielte Rückmeldung</w:t>
       </w:r>
     </w:p>
     <w:p>
       <w:r>
-        <w:t>Prüfe nur unseren folgenden Abschnitt. Unsere Erkenntnis lautet: [einsetzen]. Markiere höchstens zwei konkrete Probleme bei Plausibilität oder Sprache und erkläre sie kurz. Schreibe höchstens eine passende Alternative. Erhalte diese gelungene Stelle wortgleich: [einsetzen]. Maximal 180 Wörter Antwort. Abschnitt: [einsetzen].</w:t>
-      </w:r>
-    </w:p>
-    <w:p>
-      <w:r>
-        <w:t>Ihr entscheidet über jeden Vorschlag. Eine sichere Behauptung der KI ist kein Beleg. Sobald der Entwurf brauchbar ist, arbeitet ihr selbst weiter statt weitere vollständige Fassungen erzeugen zu lassen.</w:t>
-      </w:r>
-    </w:p>
-    <w:p>
-      <w:r>
-        <w:br w:type="page"/>
-      </w:r>
-    </w:p>
-    <w:p>
-      <w:pPr>
-        <w:pStyle w:val="Heading1"/>
-      </w:pPr>
-      <w:r>
-        <w:t>Prüfen überarbeiten und abgeben</w:t>
-      </w:r>
-    </w:p>
-    <w:p>
-      <w:pPr>
-        <w:pStyle w:val="Heading2"/>
-      </w:pPr>
-      <w:r>
-        <w:t>Zuerst Handlung und Erkenntnisse</w:t>
-      </w:r>
-    </w:p>
-    <w:p>
-      <w:r>
-        <w:t>Prüft gemeinsam: Trifft Heidi eine Entscheidung mit Folgen? Handeln die anderen Figuren aus erkennbaren Gründen? Sind Zeit, Ort und Figurenwissen mit dem gewählten Romanstand vereinbar? Verändern mindestens zwei Erkenntnisse dieselbe Situation, statt nur nacheinander erwähnt zu werden? Ein Thema aus einer anderen Gruppe darf nicht bloss als Dekoration auftauchen.</w:t>
-      </w:r>
-    </w:p>
-    <w:p>
-      <w:pPr>
-        <w:pStyle w:val="Heading2"/>
-      </w:pPr>
-      <w:r>
-        <w:t>Danach Sprache und Atmosphäre</w:t>
-      </w:r>
-    </w:p>
-    <w:p>
-      <w:r>
-        <w:t>Lest einen Absatz laut. Klingt die Figurenrede gesprochen oder wie eine Erklärung für die Leserschaft? Werden Gefühle nur behauptet oder aus Wahrnehmung und Handlung verständlich? Welche Einzelheit schafft Atmosphäre? Sind die Sätze abwechslungsreich verbunden? Ein Konjunktiv ist nicht grundsätzlich falsch; er muss zu Figur und Situation passen. Historisch klingende Wörter allein ergeben keinen Spyri-Duktus.</w:t>
-      </w:r>
-    </w:p>
-    <w:p>
-      <w:pPr>
-        <w:pStyle w:val="Heading2"/>
-      </w:pPr>
-      <w:r>
-        <w:t>Drei Überarbeitungen dokumentieren</w:t>
-      </w:r>
-    </w:p>
-    <w:p>
-      <w:r>
-        <w:t>Überarbeitet mindestens eine Stelle zur Plausibilität, eine zur Sprache und eine zur Verbindung der Erkenntnisse. Haltet jeweils kurz fest: ursprüngliche Stelle – neue Stelle – Grund der Änderung. Wenn ein Bereich schon trägt, belegt dies konkret und dokumentiert eine andere substanzielle Änderung. Bewahrt eine besonders gelungene Stelle bewusst.</w:t>
-      </w:r>
-    </w:p>
-    <w:p>
-      <w:pPr>
-        <w:pStyle w:val="Heading2"/>
-      </w:pPr>
-      <w:r>
-        <w:t>Rückmeldung der Partnergruppe</w:t>
-      </w:r>
-    </w:p>
-    <w:p>
-      <w:r>
-        <w:t>Die Partnergruppe liest zuerst nur die Erzählung. Sie benennt zwei erkennbare Themen oder Erkenntnisse und zeigt die Textstellen dazu. Erst danach vergleicht ihr mit E1 bis E3. Zusätzlich nennt sie eine unplausible oder unklare Stelle und eine besonders gelungene Passage. Keine Neufassung durch die Partnergruppe.</w:t>
-      </w:r>
-    </w:p>
-    <w:p>
-      <w:pPr>
-        <w:pStyle w:val="Heading2"/>
-      </w:pPr>
-      <w:r>
-        <w:t>Werkkommentar und Abgabe</w:t>
-      </w:r>
-    </w:p>
-    <w:p>
-      <w:r>
-        <w:t>Erklärt auf 200–250 Wörter: Wo wirken E1 bis E3, jeweils mit kurzem Zitat aus eurer Erzählung? Wie hängen zwei davon zusammen? Welche Erzählweise habt ihr aus der Originalpassage aufgegriffen? Welche grössere KI-Schwäche habt ihr korrigiert? Was bleibt eine bewusste Abweichung oder Unsicherheit?</w:t>
-      </w:r>
-    </w:p>
-    <w:p>
-      <w:r>
-        <w:t>Gebt ab: Erzählung, Erkenntnisbogen mit Fundstellen, Werkkommentar, drei Änderungen sowie verwendete Prompts und erster KI-Entwurf, falls KI eingesetzt wurde. Kennzeichnet den Text als «Neue Heidi-Erzählung von [Gruppe], mit KI-Unterstützung überarbeitet» oder entsprechend ohne KI.</w:t>
-      </w:r>
-    </w:p>
-    <w:p>
-      <w:pPr>
-        <w:pStyle w:val="Heading2"/>
-      </w:pPr>
-      <w:r>
-        <w:t>Kriterien für die Rückmeldung</w:t>
-      </w:r>
-    </w:p>
-    <w:tbl>
-      <w:tblPr>
-        <w:tblW w:type="auto" w:w="0"/>
-        <w:tblLayout w:type="fixed"/>
-        <w:tblLook w:firstColumn="1" w:firstRow="1" w:lastColumn="0" w:lastRow="0" w:noHBand="0" w:noVBand="1" w:val="04A0"/>
-      </w:tblPr>
-      <w:tblGrid>
-        <w:gridCol w:w="2880"/>
-        <w:gridCol w:w="7200"/>
-      </w:tblGrid>
-      <w:tr>
-        <w:trPr>
-          <w:cantSplit/>
-        </w:trPr>
-        <w:tc>
-          <w:tcPr>
-            <w:tcW w:type="dxa" w:w="2880"/>
-            <w:tcBorders>
-              <w:top w:val="single" w:sz="4" w:color="D9D9D9"/>
-              <w:left w:val="single" w:sz="4" w:color="D9D9D9"/>
-              <w:bottom w:val="single" w:sz="4" w:color="D9D9D9"/>
-              <w:right w:val="single" w:sz="4" w:color="D9D9D9"/>
-            </w:tcBorders>
-            <w:tcMar>
-              <w:top w:w="85" w:type="dxa"/>
-              <w:left w:w="85" w:type="dxa"/>
-              <w:bottom w:w="85" w:type="dxa"/>
-              <w:right w:w="85" w:type="dxa"/>
-            </w:tcMar>
-            <w:shd w:fill="E4ECF0"/>
-          </w:tcPr>
-          <w:p>
-            <w:pPr>
-              <w:spacing w:after="60"/>
-            </w:pPr>
-            <w:r>
-              <w:rPr>
-                <w:b/>
-                <w:sz w:val="20"/>
-              </w:rPr>
-              <w:t>Kriterium</w:t>
-            </w:r>
-          </w:p>
-        </w:tc>
-        <w:tc>
-          <w:tcPr>
-            <w:tcW w:type="dxa" w:w="7200"/>
-            <w:tcBorders>
-              <w:top w:val="single" w:sz="4" w:color="D9D9D9"/>
-              <w:left w:val="single" w:sz="4" w:color="D9D9D9"/>
-              <w:bottom w:val="single" w:sz="4" w:color="D9D9D9"/>
-              <w:right w:val="single" w:sz="4" w:color="D9D9D9"/>
-            </w:tcBorders>
-            <w:tcMar>
-              <w:top w:w="85" w:type="dxa"/>
-              <w:left w:w="85" w:type="dxa"/>
-              <w:bottom w:w="85" w:type="dxa"/>
-              <w:right w:w="85" w:type="dxa"/>
-            </w:tcMar>
-            <w:shd w:fill="E4ECF0"/>
-          </w:tcPr>
-          <w:p>
-            <w:pPr>
-              <w:spacing w:after="60"/>
-            </w:pPr>
-            <w:r>
-              <w:rPr>
-                <w:b/>
-                <w:sz w:val="20"/>
-              </w:rPr>
-              <w:t>Woran es erkennbar wird</w:t>
-            </w:r>
-          </w:p>
-        </w:tc>
-      </w:tr>
-      <w:tr>
-        <w:trPr>
-          <w:cantSplit/>
-        </w:trPr>
-        <w:tc>
-          <w:tcPr>
-            <w:tcW w:type="dxa" w:w="2880"/>
-            <w:tcBorders>
-              <w:top w:val="single" w:sz="4" w:color="D9D9D9"/>
-              <w:left w:val="single" w:sz="4" w:color="D9D9D9"/>
-              <w:bottom w:val="single" w:sz="4" w:color="D9D9D9"/>
-              <w:right w:val="single" w:sz="4" w:color="D9D9D9"/>
-            </w:tcBorders>
-            <w:tcMar>
-              <w:top w:w="85" w:type="dxa"/>
-              <w:left w:w="85" w:type="dxa"/>
-              <w:bottom w:w="85" w:type="dxa"/>
-              <w:right w:w="85" w:type="dxa"/>
-            </w:tcMar>
-          </w:tcPr>
-          <w:p>
-            <w:pPr>
-              <w:spacing w:after="60"/>
-            </w:pPr>
-            <w:r>
-              <w:rPr>
-                <w:b w:val="0"/>
-                <w:sz w:val="20"/>
-              </w:rPr>
-              <w:t>Synthese der Erkenntnisse</w:t>
-            </w:r>
-          </w:p>
-        </w:tc>
-        <w:tc>
-          <w:tcPr>
-            <w:tcW w:type="dxa" w:w="7200"/>
-            <w:tcBorders>
-              <w:top w:val="single" w:sz="4" w:color="D9D9D9"/>
-              <w:left w:val="single" w:sz="4" w:color="D9D9D9"/>
-              <w:bottom w:val="single" w:sz="4" w:color="D9D9D9"/>
-              <w:right w:val="single" w:sz="4" w:color="D9D9D9"/>
-            </w:tcBorders>
-            <w:tcMar>
-              <w:top w:w="85" w:type="dxa"/>
-              <w:left w:w="85" w:type="dxa"/>
-              <w:bottom w:w="85" w:type="dxa"/>
-              <w:right w:w="85" w:type="dxa"/>
-            </w:tcMar>
-          </w:tcPr>
-          <w:p>
-            <w:pPr>
-              <w:spacing w:after="60"/>
-            </w:pPr>
-            <w:r>
-              <w:rPr>
-                <w:b w:val="0"/>
-                <w:sz w:val="20"/>
-              </w:rPr>
-              <w:t>E1 bis E3 sind belegt; mehrere Befunde wirken in derselben Handlung zusammen.</w:t>
-            </w:r>
-          </w:p>
-        </w:tc>
-      </w:tr>
-      <w:tr>
-        <w:trPr>
-          <w:cantSplit/>
-        </w:trPr>
-        <w:tc>
-          <w:tcPr>
-            <w:tcW w:type="dxa" w:w="2880"/>
-            <w:tcBorders>
-              <w:top w:val="single" w:sz="4" w:color="D9D9D9"/>
-              <w:left w:val="single" w:sz="4" w:color="D9D9D9"/>
-              <w:bottom w:val="single" w:sz="4" w:color="D9D9D9"/>
-              <w:right w:val="single" w:sz="4" w:color="D9D9D9"/>
-            </w:tcBorders>
-            <w:tcMar>
-              <w:top w:w="85" w:type="dxa"/>
-              <w:left w:w="85" w:type="dxa"/>
-              <w:bottom w:w="85" w:type="dxa"/>
-              <w:right w:w="85" w:type="dxa"/>
-            </w:tcMar>
-          </w:tcPr>
-          <w:p>
-            <w:pPr>
-              <w:spacing w:after="60"/>
-            </w:pPr>
-            <w:r>
-              <w:rPr>
-                <w:b w:val="0"/>
-                <w:sz w:val="20"/>
-              </w:rPr>
-              <w:t>Plausibilität und Romanbezug</w:t>
-            </w:r>
-          </w:p>
-        </w:tc>
-        <w:tc>
-          <w:tcPr>
-            <w:tcW w:type="dxa" w:w="7200"/>
-            <w:tcBorders>
-              <w:top w:val="single" w:sz="4" w:color="D9D9D9"/>
-              <w:left w:val="single" w:sz="4" w:color="D9D9D9"/>
-              <w:bottom w:val="single" w:sz="4" w:color="D9D9D9"/>
-              <w:right w:val="single" w:sz="4" w:color="D9D9D9"/>
-            </w:tcBorders>
-            <w:tcMar>
-              <w:top w:w="85" w:type="dxa"/>
-              <w:left w:w="85" w:type="dxa"/>
-              <w:bottom w:w="85" w:type="dxa"/>
-              <w:right w:w="85" w:type="dxa"/>
-            </w:tcMar>
-          </w:tcPr>
-          <w:p>
-            <w:pPr>
-              <w:spacing w:after="60"/>
-            </w:pPr>
-            <w:r>
-              <w:rPr>
-                <w:b w:val="0"/>
-                <w:sz w:val="20"/>
-              </w:rPr>
-              <w:t>Motive, Figurenwissen, Entscheidungen und Konsequenzen stimmen.</w:t>
-            </w:r>
-          </w:p>
-        </w:tc>
-      </w:tr>
-      <w:tr>
-        <w:trPr>
-          <w:cantSplit/>
-        </w:trPr>
-        <w:tc>
-          <w:tcPr>
-            <w:tcW w:type="dxa" w:w="2880"/>
-            <w:tcBorders>
-              <w:top w:val="single" w:sz="4" w:color="D9D9D9"/>
-              <w:left w:val="single" w:sz="4" w:color="D9D9D9"/>
-              <w:bottom w:val="single" w:sz="4" w:color="D9D9D9"/>
-              <w:right w:val="single" w:sz="4" w:color="D9D9D9"/>
-            </w:tcBorders>
-            <w:tcMar>
-              <w:top w:w="85" w:type="dxa"/>
-              <w:left w:w="85" w:type="dxa"/>
-              <w:bottom w:w="85" w:type="dxa"/>
-              <w:right w:w="85" w:type="dxa"/>
-            </w:tcMar>
-          </w:tcPr>
-          <w:p>
-            <w:pPr>
-              <w:spacing w:after="60"/>
-            </w:pPr>
-            <w:r>
-              <w:rPr>
-                <w:b w:val="0"/>
-                <w:sz w:val="20"/>
-              </w:rPr>
-              <w:t>Erzählerische Gestaltung</w:t>
-            </w:r>
-          </w:p>
-        </w:tc>
-        <w:tc>
-          <w:tcPr>
-            <w:tcW w:type="dxa" w:w="7200"/>
-            <w:tcBorders>
-              <w:top w:val="single" w:sz="4" w:color="D9D9D9"/>
-              <w:left w:val="single" w:sz="4" w:color="D9D9D9"/>
-              <w:bottom w:val="single" w:sz="4" w:color="D9D9D9"/>
-              <w:right w:val="single" w:sz="4" w:color="D9D9D9"/>
-            </w:tcBorders>
-            <w:tcMar>
-              <w:top w:w="85" w:type="dxa"/>
-              <w:left w:w="85" w:type="dxa"/>
-              <w:bottom w:w="85" w:type="dxa"/>
-              <w:right w:w="85" w:type="dxa"/>
-            </w:tcMar>
-          </w:tcPr>
-          <w:p>
-            <w:pPr>
-              <w:spacing w:after="60"/>
-            </w:pPr>
-            <w:r>
-              <w:rPr>
-                <w:b w:val="0"/>
-                <w:sz w:val="20"/>
-              </w:rPr>
-              <w:t>Atmosphäre, Perspektive, Dialog und Schluss sind bewusst gestaltet.</w:t>
-            </w:r>
-          </w:p>
-        </w:tc>
-      </w:tr>
-      <w:tr>
-        <w:trPr>
-          <w:cantSplit/>
-        </w:trPr>
-        <w:tc>
-          <w:tcPr>
-            <w:tcW w:type="dxa" w:w="2880"/>
-            <w:tcBorders>
-              <w:top w:val="single" w:sz="4" w:color="D9D9D9"/>
-              <w:left w:val="single" w:sz="4" w:color="D9D9D9"/>
-              <w:bottom w:val="single" w:sz="4" w:color="D9D9D9"/>
-              <w:right w:val="single" w:sz="4" w:color="D9D9D9"/>
-            </w:tcBorders>
-            <w:tcMar>
-              <w:top w:w="85" w:type="dxa"/>
-              <w:left w:w="85" w:type="dxa"/>
-              <w:bottom w:w="85" w:type="dxa"/>
-              <w:right w:w="85" w:type="dxa"/>
-            </w:tcMar>
-          </w:tcPr>
-          <w:p>
-            <w:pPr>
-              <w:spacing w:after="60"/>
-            </w:pPr>
-            <w:r>
-              <w:rPr>
-                <w:b w:val="0"/>
-                <w:sz w:val="20"/>
-              </w:rPr>
-              <w:t>Überarbeitung und Reflexion</w:t>
-            </w:r>
-          </w:p>
-        </w:tc>
-        <w:tc>
-          <w:tcPr>
-            <w:tcW w:type="dxa" w:w="7200"/>
-            <w:tcBorders>
-              <w:top w:val="single" w:sz="4" w:color="D9D9D9"/>
-              <w:left w:val="single" w:sz="4" w:color="D9D9D9"/>
-              <w:bottom w:val="single" w:sz="4" w:color="D9D9D9"/>
-              <w:right w:val="single" w:sz="4" w:color="D9D9D9"/>
-            </w:tcBorders>
-            <w:tcMar>
-              <w:top w:w="85" w:type="dxa"/>
-              <w:left w:w="85" w:type="dxa"/>
-              <w:bottom w:w="85" w:type="dxa"/>
-              <w:right w:w="85" w:type="dxa"/>
-            </w:tcMar>
-          </w:tcPr>
-          <w:p>
-            <w:pPr>
-              <w:spacing w:after="60"/>
-            </w:pPr>
-            <w:r>
-              <w:rPr>
-                <w:b w:val="0"/>
-                <w:sz w:val="20"/>
-              </w:rPr>
-              <w:t>Eigene Eingriffe verbessern den Text; Quellen und KI-Anteile sind nachvollziehbar.</w:t>
-            </w:r>
-          </w:p>
-        </w:tc>
-      </w:tr>
-    </w:tbl>
-    <w:p>
-      <w:r>
-        <w:br w:type="page"/>
-      </w:r>
-    </w:p>
-    <w:p>
-      <w:pPr>
-        <w:pStyle w:val="Heading1"/>
-      </w:pPr>
-      <w:r>
-        <w:t>Hinweise für die Lehrperson</w:t>
-      </w:r>
-    </w:p>
-    <w:p>
-      <w:pPr>
-        <w:pStyle w:val="Heading2"/>
-      </w:pPr>
-      <w:r>
-        <w:t>Umfang und Vorbereitung</w:t>
-      </w:r>
-    </w:p>
-    <w:p>
-      <w:r>
-        <w:t>Vorschlag für den Abschluss der Gruppenarbeiten: drei Lektionen zu 45 Minuten in Gruppen von drei bis vier Personen. Vor dem Schreibauftrag einen kurzen Austausch der Gruppenergebnisse ermöglichen. Jede Gruppe bringt zwei Romanbelege mit; für den gruppenübergreifenden Transfer werden Ergebnisblätter oder kurze Präsentationen benötigt. Das Quellenblatt kann auch an Arbeitsergebnisse aus der Ausstellung «Spyri 200 — Mehr als Heidi» anschliessen.</w:t>
-      </w:r>
-    </w:p>
-    <w:p>
-      <w:r>
-        <w:t>Der Auftrag bewertet Synthese und Redaktion, nicht die Leistungsfähigkeit eines verfügbaren KI-Modells. Vorab festlegen, ob Ergänzung, Fortschreibung oder eine Gegenwartsübertragung zulässig ist und ob nur der erste oder beide Heidi-Bände als gemeinsamer Wissensstand gelten. Die konkreten Projektthemen werden in den Erkenntnisbogen eingetragen.</w:t>
-      </w:r>
-    </w:p>
-    <w:p>
-      <w:pPr>
-        <w:pStyle w:val="Heading2"/>
-      </w:pPr>
-      <w:r>
-        <w:t>Kostenloses ChatGPT genügt für den vorgesehenen Ablauf</w:t>
-      </w:r>
-    </w:p>
-    <w:p>
-      <w:r>
-        <w:t>Die offizielle Free-Tier-FAQ beschreibt kostenlosen Textchat; Uploads und weitere Werkzeuge unterliegen eigenen Grenzen. Der Auftrag setzt daher ausschliesslich Texteingaben voraus, keine Dateien, Websuche, Bilder, eigenen GPTs, API oder Bezahlfunktionen. Verfügbare Modelle und Regeln können sich ändern. Eine Unterrichtsplanung sollte keinen bestimmten Modellnamen und keine feste Zahl garantierter Antworten voraussetzen.</w:t>
-      </w:r>
-    </w:p>
-    <w:p>
-      <w:r>
-        <w:t>Pro Gruppe bedient eine Person ihr eigenes zulässiges Konto, während alle am Gruppendokument arbeiten; Zugangsdaten werden nicht geteilt. Schulische Vorgaben für Konten und Dateneingaben gelten. In den Prompt gehören literarische Befunde, keine persönlichen Informationen über Mitschülerinnen und Mitschüler.</w:t>
-      </w:r>
-    </w:p>
-    <w:p>
-      <w:pPr>
-        <w:pStyle w:val="Heading2"/>
-      </w:pPr>
-      <w:r>
-        <w:t>Bei fehlendem Zugang oder einer Unterbrechung</w:t>
-      </w:r>
-    </w:p>
-    <w:p>
-      <w:r>
-        <w:t>Die Gruppe schreibt den Entwurf anhand ihres Fünfschrittplans selbst. Alternativ stellt die Lehrperson einen vorab erzeugten, ausdrücklich als solchen markierten Entwurf bereit. Dieselben Kriterien und derselbe Überarbeitungsnachweis gelten. Bereits erzeugten Text sofort lokal sichern; bei einer Unterbrechung nicht auf weitere Antworten warten. Ein Neustart braucht nur den Plan und den aktuellen Abschnitt, nicht den ganzen Chatverlauf.</w:t>
-      </w:r>
-    </w:p>
-    <w:p>
-      <w:pPr>
-        <w:pStyle w:val="Heading2"/>
-      </w:pPr>
-      <w:r>
-        <w:t>LM Studio ist für diesen Auftrag nicht erforderlich</w:t>
-      </w:r>
-    </w:p>
-    <w:p>
-      <w:r>
-        <w:t>Eine zusätzliche lokale Installation würde Geräteprüfung, Einrichtung und Modellwahl zum Unterrichtsthema machen. Unsere bisherigen lokalen Analyseversuche belegten keinen Qualitätsvorteil. Für diesen Abschlussauftrag ist der einfache Textdialog die passendere Ausgangslage. Ein lokaler Betrieb wäre ein getrennt vorzubereitender technischer Versuch, etwa bei ausdrücklich gewünschtem Offline-Betrieb auf bereits erprobten Geräten.</w:t>
-      </w:r>
-    </w:p>
-    <w:p>
-      <w:pPr>
-        <w:pStyle w:val="Heading2"/>
-      </w:pPr>
-      <w:r>
-        <w:t>Didaktischer Prüfpunkt</w:t>
-      </w:r>
-    </w:p>
-    <w:p>
-      <w:r>
-        <w:t>Die ausformulierte Geschichte allein zeigt die Erkenntnisleistung nicht zuverlässig. Entscheidend sind die belegten Ausgangsaussagen, ihre Umsetzung im Konflikt und die dokumentierten Eingriffe. Ein glatter KI-Text mit nur beiläufig erwähnten Themen erfüllt den Syntheseauftrag nicht. Die gemeinsam erarbeitete Verena-Szene kann optional vorab als Beispiel für Revision dienen; sie ist eine Neuschöpfung und kein Spyri-Original.</w:t>
-      </w:r>
-    </w:p>
-    <w:p>
-      <w:pPr>
-        <w:pStyle w:val="Heading2"/>
-      </w:pPr>
-      <w:r>
-        <w:t>Ressourcen und Stand</w:t>
-      </w:r>
-    </w:p>
-    <w:p>
-      <w:r>
-        <w:t>Ausstellung: https://spyri-200-ausstellung.patrickoliverfischer.chatgpt.site/</w:t>
+        <w:t>Prüfe unseren folgenden Abschnitt im Zusammenhang mit unserem Spyri200-Projekt.</w:t>
         <w:br/>
-        <w:t>Arbeitsgrundlage: gemeinsam entwickeltes Spyri-Schreibpaket, 4. Oktober 2026.</w:t>
+        <w:t>Projekt, Leitfrage und Texte: [einsetzen]</w:t>
         <w:br/>
-        <w:t>Technik: OpenAI, ChatGPT Free Tier FAQ, abgerufen am 4. Oktober 2026: https://help.openai.com/en/articles/9275245-chatgpt-free-tier-faq</w:t>
+        <w:t>Unsere Erkenntnisse: [einsetzen]</w:t>
+        <w:br/>
+        <w:t>Nenne höchstens zwei konkrete Probleme bei Plausibilität, Umsetzung der Erkenntnisse oder Sprache und begründe sie kurz. Schlage höchstens eine passende Alternative vor. Erfinde keine Textbelege. Verwende Schweizer Rechtschreibung mit ss und Guillemets («…»).</w:t>
+        <w:br/>
+        <w:t>Erhalte diese gelungene Stelle wortgleich: [einsetzen]</w:t>
+        <w:br/>
+        <w:t>Maximal 180 Wörter Antwort.</w:t>
+        <w:br/>
+        <w:t>Abschnitt: [einsetzen]</w:t>
       </w:r>
     </w:p>
     <w:sectPr>
       <w:footerReference w:type="default" r:id="rId9"/>
       <w:pgSz w:w="12240" w:h="15840"/>
-      <w:pgMar w:top="936" w:right="1080" w:bottom="936" w:left="1080" w:header="720" w:footer="720" w:gutter="0"/>
+      <w:pgMar w:top="964" w:right="1080" w:bottom="964" w:left="1080" w:header="720" w:footer="720" w:gutter="0"/>
       <w:cols w:space="720"/>
       <w:docGrid w:linePitch="360"/>
     </w:sectPr>
@@ -1880,7 +747,7 @@
     <w:qFormat/>
     <w:rsid w:val="00FC693F"/>
     <w:pPr>
-      <w:spacing w:after="100" w:line="245" w:lineRule="auto"/>
+      <w:spacing w:after="120" w:line="252" w:lineRule="auto"/>
     </w:pPr>
     <w:rPr>
       <w:rFonts w:ascii="Calibri" w:hAnsi="Calibri"/>

</xml_diff>